<commit_message>
Docs: clarify domain and whole-terminology scaling
</commit_message>
<xml_diff>
--- a/docs/SNOMED_CT_in_Any_Language_AI_Assisted_Translation_with_SME_Feedback.docx
+++ b/docs/SNOMED_CT_in_Any_Language_AI_Assisted_Translation_with_SME_Feedback.docx
@@ -3508,6 +3508,186 @@
           <w:shd w:fill="auto" w:val="clear"/>
         </w:rPr>
         <w:t>Once the agreed quality threshold is met, freeze the winning model, prompt, guide, rules, pool, and code versions. Run the broader scope, audit the output, resolve blockers, and obtain formal SME sign-off before publication.</w:t>
+      </w:r>
+    </w:p>
+    <w:p>
+      <w:pPr>
+        <w:pStyle w:val="Heading2"/>
+        <w:bidi w:val="0"/>
+        <w:spacing w:before="181" w:after="68"/>
+        <w:ind w:hanging="0" w:start="0"/>
+        <w:jc w:val="start"/>
+        <w:rPr>
+          <w:rFonts w:ascii="Arial" w:hAnsi="Arial"/>
+          <w:b/>
+          <w:color w:val="173B57"/>
+          <w:sz w:val="25"/>
+          <w:shd w:fill="auto" w:val="clear"/>
+        </w:rPr>
+      </w:pPr>
+      <w:r>
+        <w:rPr>
+          <w:b/>
+          <w:color w:val="173B57"/>
+          <w:sz w:val="25"/>
+          <w:shd w:fill="auto" w:val="clear"/>
+        </w:rPr>
+        <w:t>Two delivery patterns</w:t>
+      </w:r>
+    </w:p>
+    <w:p>
+      <w:pPr>
+        <w:pStyle w:val="Normal"/>
+        <w:bidi w:val="0"/>
+        <w:spacing w:before="0" w:after="116"/>
+        <w:ind w:hanging="0" w:start="0"/>
+        <w:jc w:val="start"/>
+        <w:rPr>
+          <w:rFonts w:ascii="Arial" w:hAnsi="Arial"/>
+          <w:b w:val="false"/>
+          <w:color w:val="243746"/>
+          <w:sz w:val="21"/>
+          <w:shd w:fill="auto" w:val="clear"/>
+        </w:rPr>
+      </w:pPr>
+      <w:r>
+        <w:rPr>
+          <w:rFonts w:ascii="Arial" w:hAnsi="Arial"/>
+          <w:b w:val="false"/>
+          <w:color w:val="243746"/>
+          <w:sz w:val="21"/>
+          <w:shd w:fill="auto" w:val="clear"/>
+        </w:rPr>
+        <w:t>The scope of the country's need determines how this process is applied:</w:t>
+      </w:r>
+    </w:p>
+    <w:p>
+      <w:pPr>
+        <w:pStyle w:val="Normal"/>
+        <w:bidi w:val="0"/>
+        <w:spacing w:before="0" w:after="51"/>
+        <w:ind w:hanging="238" w:start="397"/>
+        <w:jc w:val="start"/>
+        <w:rPr>
+          <w:rFonts w:ascii="Arial" w:hAnsi="Arial"/>
+          <w:b w:val="false"/>
+          <w:color w:val="243746"/>
+          <w:sz w:val="21"/>
+          <w:shd w:fill="auto" w:val="clear"/>
+        </w:rPr>
+      </w:pPr>
+      <w:r>
+        <w:rPr>
+          <w:b w:val="false"/>
+          <w:color w:val="243746"/>
+          <w:sz w:val="21"/>
+          <w:shd w:fill="auto" w:val="clear"/>
+        </w:rPr>
+        <w:t xml:space="preserve">•  </w:t>
+      </w:r>
+      <w:r>
+        <w:rPr>
+          <w:b w:val="false"/>
+          <w:color w:val="243746"/>
+          <w:sz w:val="21"/>
+          <w:shd w:fill="auto" w:val="clear"/>
+        </w:rPr>
+        <w:t xml:space="preserve">A </w:t>
+      </w:r>
+      <w:r>
+        <w:rPr>
+          <w:b/>
+          <w:color w:val="243746"/>
+          <w:sz w:val="21"/>
+          <w:shd w:fill="auto" w:val="clear"/>
+        </w:rPr>
+        <w:t>targeted-domain project</w:t>
+      </w:r>
+      <w:r>
+        <w:rPr>
+          <w:b w:val="false"/>
+          <w:color w:val="243746"/>
+          <w:sz w:val="21"/>
+          <w:shd w:fill="auto" w:val="clear"/>
+        </w:rPr>
+        <w:t xml:space="preserve"> can run the complete feedback and improvement cycle for one clinical area, produce a signed-off domain translation, and stop there. A country does not need to commit to translating the wider terminology.</w:t>
+      </w:r>
+    </w:p>
+    <w:p>
+      <w:pPr>
+        <w:pStyle w:val="Normal"/>
+        <w:bidi w:val="0"/>
+        <w:spacing w:before="0" w:after="51"/>
+        <w:ind w:hanging="238" w:start="397"/>
+        <w:jc w:val="start"/>
+        <w:rPr>
+          <w:rFonts w:ascii="Arial" w:hAnsi="Arial"/>
+          <w:b w:val="false"/>
+          <w:color w:val="243746"/>
+          <w:sz w:val="21"/>
+          <w:shd w:fill="auto" w:val="clear"/>
+        </w:rPr>
+      </w:pPr>
+      <w:r>
+        <w:rPr>
+          <w:b w:val="false"/>
+          <w:color w:val="243746"/>
+          <w:sz w:val="21"/>
+          <w:shd w:fill="auto" w:val="clear"/>
+        </w:rPr>
+        <w:t xml:space="preserve">•  </w:t>
+      </w:r>
+      <w:r>
+        <w:rPr>
+          <w:b w:val="false"/>
+          <w:color w:val="243746"/>
+          <w:sz w:val="21"/>
+          <w:shd w:fill="auto" w:val="clear"/>
+        </w:rPr>
+        <w:t xml:space="preserve">A </w:t>
+      </w:r>
+      <w:r>
+        <w:rPr>
+          <w:b/>
+          <w:color w:val="243746"/>
+          <w:sz w:val="21"/>
+          <w:shd w:fill="auto" w:val="clear"/>
+        </w:rPr>
+        <w:t>broad-terminology programme</w:t>
+      </w:r>
+      <w:r>
+        <w:rPr>
+          <w:b w:val="false"/>
+          <w:color w:val="243746"/>
+          <w:sz w:val="21"/>
+          <w:shd w:fill="auto" w:val="clear"/>
+        </w:rPr>
+        <w:t xml:space="preserve"> should avoid treating every domain as a separate project. Establish the language once, optimise an initial approach on a representative cross-domain sample, and then score its quality by domain. Repeat domain-specific SME feedback and optimisation only where a domain falls below the agreed quality gate. Domains that already meet the gate can proceed to production and proportionate assurance using the shared language configuration.</w:t>
+      </w:r>
+    </w:p>
+    <w:p>
+      <w:pPr>
+        <w:pStyle w:val="Normal"/>
+        <w:bidi w:val="0"/>
+        <w:spacing w:before="0" w:after="116"/>
+        <w:ind w:hanging="0" w:start="0"/>
+        <w:jc w:val="start"/>
+        <w:rPr>
+          <w:rFonts w:ascii="Arial" w:hAnsi="Arial"/>
+          <w:b w:val="false"/>
+          <w:color w:val="243746"/>
+          <w:sz w:val="21"/>
+          <w:shd w:fill="auto" w:val="clear"/>
+        </w:rPr>
+      </w:pPr>
+      <w:r>
+        <w:rPr>
+          <w:b w:val="false"/>
+          <w:color w:val="243746"/>
+          <w:sz w:val="21"/>
+          <w:shd w:fill="auto" w:val="clear"/>
+        </w:rPr>
+        <w:t>This staged approach creates potential economies of scale without assuming that one prompt will work equally well everywhere. The amount of domain-specific work remains an evidence question: it depends on cross-domain performance, clinical risk, and the level of assurance required by the country.</w:t>
       </w:r>
     </w:p>
     <w:p>
@@ -4898,7 +5078,7 @@
                 <w:color w:val="FFFFFF"/>
                 <w:sz w:val="18"/>
               </w:rPr>
-              <w:t>Planning assumption for a roughly 5,000-concept domain</w:t>
+              <w:t>How the effort scales</w:t>
             </w:r>
           </w:p>
         </w:tc>
@@ -4934,7 +5114,7 @@
                 <w:color w:val="243746"/>
                 <w:sz w:val="18"/>
               </w:rPr>
-              <w:t>One standard SME round</w:t>
+              <w:t>Language and platform setup</w:t>
             </w:r>
           </w:p>
         </w:tc>
@@ -4967,7 +5147,7 @@
                 <w:color w:val="243746"/>
                 <w:sz w:val="18"/>
               </w:rPr>
-              <w:t>about 2–4 hours for a 100–120-term sample and adjudication questions</w:t>
+              <w:t>approximately one operator week, primarily once per language—not once per domain or per 5,000 concepts</w:t>
             </w:r>
           </w:p>
         </w:tc>
@@ -5003,7 +5183,7 @@
                 <w:color w:val="243746"/>
                 <w:sz w:val="18"/>
               </w:rPr>
-              <w:t>Number of rounds</w:t>
+              <w:t>Initial optimisation</w:t>
             </w:r>
           </w:p>
         </w:tc>
@@ -5036,7 +5216,7 @@
                 <w:color w:val="243746"/>
                 <w:sz w:val="18"/>
               </w:rPr>
-              <w:t>commonly 3–5</w:t>
+              <w:t>focused on the requested domain for a targeted project; based on a representative cross-domain sample for a broad programme</w:t>
             </w:r>
           </w:p>
         </w:tc>
@@ -5072,7 +5252,7 @@
                 <w:color w:val="243746"/>
                 <w:sz w:val="18"/>
               </w:rPr>
-              <w:t>Total SME effort</w:t>
+              <w:t>One standard feedback round</w:t>
             </w:r>
           </w:p>
         </w:tc>
@@ -5105,7 +5285,7 @@
                 <w:color w:val="243746"/>
                 <w:sz w:val="18"/>
               </w:rPr>
-              <w:t>about 10–20 hours with useful existing reference data</w:t>
+              <w:t>about 2–4 SME hours for a 100–120-term sample, plus approximately 1–2 operator days to prepare, integrate, and verify the round</w:t>
             </w:r>
           </w:p>
         </w:tc>
@@ -5141,7 +5321,7 @@
                 <w:color w:val="243746"/>
                 <w:sz w:val="18"/>
               </w:rPr>
-              <w:t>Greenfield allowance</w:t>
+              <w:t>Subsequent domain assessment</w:t>
             </w:r>
           </w:p>
         </w:tc>
@@ -5174,7 +5354,7 @@
                 <w:color w:val="243746"/>
                 <w:sz w:val="18"/>
               </w:rPr>
-              <w:t>roughly 50% more SME effort and one or two additional rounds</w:t>
+              <w:t>automated evaluation and sampled SME review before deciding whether more domain-specific work is justified</w:t>
             </w:r>
           </w:p>
         </w:tc>
@@ -5193,6 +5373,7 @@
           <w:p>
             <w:pPr>
               <w:pStyle w:val="TableContents"/>
+              <w:keepNext w:val="true"/>
               <w:bidi w:val="0"/>
               <w:spacing w:before="0" w:after="0"/>
               <w:jc w:val="start"/>
@@ -5209,7 +5390,7 @@
                 <w:color w:val="243746"/>
                 <w:sz w:val="18"/>
               </w:rPr>
-              <w:t>Operator effort</w:t>
+              <w:t>Domain-specific optimisation</w:t>
             </w:r>
           </w:p>
         </w:tc>
@@ -5242,7 +5423,144 @@
                 <w:color w:val="243746"/>
                 <w:sz w:val="18"/>
               </w:rPr>
-              <w:t>approximately one setup week, then 1–2 days per round</w:t>
+              <w:t>conditional; repeat the feedback cycle only for domains that do not meet the shared quality gate</w:t>
+            </w:r>
+          </w:p>
+        </w:tc>
+      </w:tr>
+      <w:tr>
+        <w:trPr/>
+        <w:tc>
+          <w:tcPr>
+            <w:tcW w:w="4791" w:type="dxa"/>
+            <w:tcBorders>
+              <w:start w:val="single" w:sz="3" w:space="0" w:color="CAD4DA"/>
+              <w:bottom w:val="single" w:sz="3" w:space="0" w:color="CAD4DA"/>
+            </w:tcBorders>
+            <w:shd w:fill="F6F8F9" w:val="clear"/>
+          </w:tcPr>
+          <w:p>
+            <w:pPr>
+              <w:pStyle w:val="TableContents"/>
+              <w:keepNext w:val="true"/>
+              <w:bidi w:val="0"/>
+              <w:spacing w:before="0" w:after="0"/>
+              <w:jc w:val="start"/>
+              <w:rPr>
+                <w:rFonts w:ascii="Arial" w:hAnsi="Arial"/>
+                <w:b w:val="false"/>
+                <w:color w:val="243746"/>
+                <w:sz w:val="18"/>
+              </w:rPr>
+            </w:pPr>
+            <w:r>
+              <w:rPr>
+                <w:b w:val="false"/>
+                <w:color w:val="243746"/>
+                <w:sz w:val="18"/>
+              </w:rPr>
+              <w:t>Targeted-domain planning anchor</w:t>
+            </w:r>
+          </w:p>
+        </w:tc>
+        <w:tc>
+          <w:tcPr>
+            <w:tcW w:w="4791" w:type="dxa"/>
+            <w:tcBorders>
+              <w:start w:val="single" w:sz="3" w:space="0" w:color="CAD4DA"/>
+              <w:bottom w:val="single" w:sz="3" w:space="0" w:color="CAD4DA"/>
+              <w:end w:val="single" w:sz="3" w:space="0" w:color="CAD4DA"/>
+            </w:tcBorders>
+            <w:shd w:fill="F6F8F9" w:val="clear"/>
+          </w:tcPr>
+          <w:p>
+            <w:pPr>
+              <w:pStyle w:val="TableContents"/>
+              <w:bidi w:val="0"/>
+              <w:spacing w:before="0" w:after="0"/>
+              <w:jc w:val="start"/>
+              <w:rPr>
+                <w:rFonts w:ascii="Arial" w:hAnsi="Arial"/>
+                <w:b w:val="false"/>
+                <w:color w:val="243746"/>
+                <w:sz w:val="18"/>
+              </w:rPr>
+            </w:pPr>
+            <w:r>
+              <w:rPr>
+                <w:b w:val="false"/>
+                <w:color w:val="243746"/>
+                <w:sz w:val="18"/>
+              </w:rPr>
+              <w:t>about 10–20 SME hours across commonly 3–5 rounds for an imaging-scale domain with useful existing reference data</w:t>
+            </w:r>
+          </w:p>
+        </w:tc>
+      </w:tr>
+      <w:tr>
+        <w:trPr/>
+        <w:tc>
+          <w:tcPr>
+            <w:tcW w:w="4791" w:type="dxa"/>
+            <w:tcBorders>
+              <w:start w:val="single" w:sz="3" w:space="0" w:color="CAD4DA"/>
+              <w:bottom w:val="single" w:sz="3" w:space="0" w:color="CAD4DA"/>
+            </w:tcBorders>
+            <w:shd w:fill="FFFFFF" w:val="clear"/>
+          </w:tcPr>
+          <w:p>
+            <w:pPr>
+              <w:pStyle w:val="TableContents"/>
+              <w:bidi w:val="0"/>
+              <w:spacing w:before="0" w:after="0"/>
+              <w:jc w:val="start"/>
+              <w:rPr>
+                <w:rFonts w:ascii="Arial" w:hAnsi="Arial"/>
+                <w:b w:val="false"/>
+                <w:color w:val="243746"/>
+                <w:sz w:val="18"/>
+              </w:rPr>
+            </w:pPr>
+            <w:r>
+              <w:rPr>
+                <w:b w:val="false"/>
+                <w:color w:val="243746"/>
+                <w:sz w:val="18"/>
+              </w:rPr>
+              <w:t>Greenfield allowance</w:t>
+            </w:r>
+          </w:p>
+        </w:tc>
+        <w:tc>
+          <w:tcPr>
+            <w:tcW w:w="4791" w:type="dxa"/>
+            <w:tcBorders>
+              <w:start w:val="single" w:sz="3" w:space="0" w:color="CAD4DA"/>
+              <w:bottom w:val="single" w:sz="3" w:space="0" w:color="CAD4DA"/>
+              <w:end w:val="single" w:sz="3" w:space="0" w:color="CAD4DA"/>
+            </w:tcBorders>
+            <w:shd w:fill="FFFFFF" w:val="clear"/>
+          </w:tcPr>
+          <w:p>
+            <w:pPr>
+              <w:pStyle w:val="TableContents"/>
+              <w:bidi w:val="0"/>
+              <w:spacing w:before="0" w:after="0"/>
+              <w:jc w:val="start"/>
+              <w:rPr>
+                <w:rFonts w:ascii="Arial" w:hAnsi="Arial"/>
+                <w:b w:val="false"/>
+                <w:color w:val="243746"/>
+                <w:sz w:val="18"/>
+              </w:rPr>
+            </w:pPr>
+            <w:r>
+              <w:rPr>
+                <w:b w:val="false"/>
+                <w:color w:val="243746"/>
+                <w:sz w:val="18"/>
+              </w:rPr>
+              <w:t>a targeted project may need roughly 50% more SME effort and one or two additional rounds</w:t>
             </w:r>
           </w:p>
         </w:tc>
@@ -5290,7 +5608,52 @@
           <w:sz w:val="21"/>
           <w:shd w:fill="auto" w:val="clear"/>
         </w:rPr>
-        <w:t>These are planning anchors from one language and domain, not fixed quotations. A customer price must also recover hosting, storage, indexing, monitoring, support, security, data governance, failed runs, provider-price changes, invoicing, and service margin.</w:t>
+        <w:t xml:space="preserve">The numerical anchors come primarily from the Korean imaging work. They describe a targeted domain of roughly 5,000 concepts; they are </w:t>
+      </w:r>
+      <w:r>
+        <w:rPr>
+          <w:rFonts w:ascii="Arial" w:hAnsi="Arial"/>
+          <w:b/>
+          <w:color w:val="243746"/>
+          <w:sz w:val="21"/>
+          <w:shd w:fill="auto" w:val="clear"/>
+        </w:rPr>
+        <w:t>not a unit cost to multiply across the full terminology</w:t>
+      </w:r>
+      <w:r>
+        <w:rPr>
+          <w:rFonts w:ascii="Arial" w:hAnsi="Arial"/>
+          <w:b w:val="false"/>
+          <w:color w:val="243746"/>
+          <w:sz w:val="21"/>
+          <w:shd w:fill="auto" w:val="clear"/>
+        </w:rPr>
+        <w:t>. A credible whole-terminology estimate requires the initial cross-domain evaluation to show how many domains meet the shared quality gate, how many need further optimisation, and how much sampled or exhaustive SME assurance each domain requires.</w:t>
+      </w:r>
+    </w:p>
+    <w:p>
+      <w:pPr>
+        <w:pStyle w:val="Normal"/>
+        <w:bidi w:val="0"/>
+        <w:spacing w:before="0" w:after="116"/>
+        <w:ind w:hanging="0" w:start="0"/>
+        <w:jc w:val="start"/>
+        <w:rPr>
+          <w:rFonts w:ascii="Arial" w:hAnsi="Arial"/>
+          <w:b w:val="false"/>
+          <w:color w:val="243746"/>
+          <w:sz w:val="21"/>
+          <w:shd w:fill="auto" w:val="clear"/>
+        </w:rPr>
+      </w:pPr>
+      <w:r>
+        <w:rPr>
+          <w:b w:val="false"/>
+          <w:color w:val="243746"/>
+          <w:sz w:val="21"/>
+          <w:shd w:fill="auto" w:val="clear"/>
+        </w:rPr>
+        <w:t>A customer price must also recover hosting, storage, indexing, monitoring, support, security, data governance, failed runs, provider-price changes, invoicing, and service margin.</w:t>
       </w:r>
     </w:p>
     <w:p>
@@ -5692,7 +6055,7 @@
         <w:sz w:val="16"/>
         <w:color w:val="607582"/>
       </w:rPr>
-      <w:t>9</w:t>
+      <w:t>10</w:t>
     </w:r>
     <w:r>
       <w:rPr>

</xml_diff>